<commit_message>
Update positioning: title, location, CV, OG image
</commit_message>
<xml_diff>
--- a/public/files/Frankline_Macharia_CV.docx
+++ b/public/files/Frankline_Macharia_CV.docx
@@ -23,7 +23,7 @@
           <w:b/>
           <w:sz w:val="21"/>
         </w:rPr>
-        <w:t>Web Developer &amp; SEO/SEM Specialist</w:t>
+        <w:t>Front-End &amp; Software Developer | SEO &amp; GEO Specialist</w:t>
       </w:r>
     </w:p>
     <w:p>
@@ -32,7 +32,7 @@
         <w:jc w:val="center"/>
       </w:pPr>
       <w:r>
-        <w:t>Eldoret, Kenya  |  franklinemacharia0@gmail.com  |  +254 710 542 773</w:t>
+        <w:t>Nakuru, Kenya  |  franklinemacharia0@gmail.com  |  +254 710 542 773</w:t>
         <w:br/>
       </w:r>
       <w:r>
@@ -59,7 +59,7 @@
         <w:spacing w:after="80"/>
       </w:pPr>
       <w:r>
-        <w:t>ICT graduate and web developer with practical experience in website development, web applications, APIs, databases, automation and SEO/SEM. I have built and maintained websites and digital products across several industries, and enjoy solving technical problems and learning new technologies. I am open to web development, IT support and systems-focused roles, remote or on-site, in Kenya or internationally.</w:t>
+        <w:t>ICT graduate and front-end/software developer with practical experience in website development, web applications, APIs, databases, automation and SEO/SEM. I have built and maintained websites and digital products across several industries, and enjoy solving technical problems and learning new technologies. I am open to web development, IT support and systems-focused roles, remote or on-site, in Kenya or internationally.</w:t>
       </w:r>
     </w:p>
     <w:p>
@@ -86,7 +86,7 @@
           <w:b/>
           <w:sz w:val="20"/>
         </w:rPr>
-        <w:t>Web Developer &amp; SEO/SEM Specialist</w:t>
+        <w:t>Front-End &amp; Software Developer | SEO &amp; GEO Specialist</w:t>
       </w:r>
       <w:r>
         <w:t xml:space="preserve">  |  Schlacht Media</w:t>
@@ -291,6 +291,73 @@
       </w:r>
       <w:r>
         <w:t>Manage website content, performance and technical improvements.</w:t>
+      </w:r>
+    </w:p>
+    <w:p>
+      <w:pPr>
+        <w:spacing w:before="60" w:after="0"/>
+      </w:pPr>
+      <w:r>
+        <w:rPr>
+          <w:b/>
+          <w:sz w:val="20"/>
+        </w:rPr>
+        <w:t>ICT Attachment</w:t>
+      </w:r>
+      <w:r>
+        <w:t xml:space="preserve">  |  Nakuru County Government – Shabab Digital Centre</w:t>
+      </w:r>
+      <w:r>
+        <w:rPr>
+          <w:i/>
+        </w:rPr>
+        <w:br/>
+        <w:t>Sep – Nov 2023  |  Nakuru, Kenya</w:t>
+      </w:r>
+    </w:p>
+    <w:p>
+      <w:pPr>
+        <w:spacing w:after="30"/>
+        <w:ind w:left="230" w:hanging="173"/>
+      </w:pPr>
+      <w:r>
+        <w:rPr>
+          <w:b/>
+        </w:rPr>
+        <w:t xml:space="preserve">• </w:t>
+      </w:r>
+      <w:r>
+        <w:t>Resolved hardware and software issues and supported LAN management and troubleshooting.</w:t>
+      </w:r>
+    </w:p>
+    <w:p>
+      <w:pPr>
+        <w:spacing w:after="30"/>
+        <w:ind w:left="230" w:hanging="173"/>
+      </w:pPr>
+      <w:r>
+        <w:rPr>
+          <w:b/>
+        </w:rPr>
+        <w:t xml:space="preserve">• </w:t>
+      </w:r>
+      <w:r>
+        <w:t>Provided on-site ICT support to office users and assisted with computer hardware/software upgrades.</w:t>
+      </w:r>
+    </w:p>
+    <w:p>
+      <w:pPr>
+        <w:spacing w:after="30"/>
+        <w:ind w:left="230" w:hanging="173"/>
+      </w:pPr>
+      <w:r>
+        <w:rPr>
+          <w:b/>
+        </w:rPr>
+        <w:t xml:space="preserve">• </w:t>
+      </w:r>
+      <w:r>
+        <w:t>Configured antivirus software and supported computer system security and data management.</w:t>
       </w:r>
     </w:p>
     <w:p>

</xml_diff>